<commit_message>
fix: rapikan blok tanda tangan surat publikasi agar simetris, terpusat dan tidak terpisah
</commit_message>
<xml_diff>
--- a/template_publikasi.docx
+++ b/template_publikasi.docx
@@ -566,44 +566,62 @@
         <w:tblW w:type="auto" w:w="0"/>
         <w:jc w:val="center"/>
         <w:tblLook w:firstColumn="1" w:firstRow="1" w:lastColumn="0" w:lastRow="0" w:noHBand="0" w:noVBand="1" w:val="04A0"/>
+        <w:tblBorders>
+          <w:top w:val="none"/>
+          <w:left w:val="none"/>
+          <w:bottom w:val="none"/>
+          <w:right w:val="none"/>
+          <w:insideH w:val="none"/>
+          <w:insideV w:val="none"/>
+        </w:tblBorders>
       </w:tblPr>
       <w:tblGrid>
-        <w:gridCol w:w="4706"/>
-        <w:gridCol w:w="4706"/>
+        <w:gridCol w:w="5200"/>
+        <w:gridCol w:w="4000"/>
       </w:tblGrid>
       <w:tr>
         <w:tc>
           <w:tcPr>
-            <w:tcW w:type="dxa" w:w="4819"/>
+            <w:tcW w:type="dxa" w:w="5200"/>
           </w:tcPr>
           <w:p/>
         </w:tc>
         <w:tc>
           <w:tcPr>
-            <w:tcW w:type="dxa" w:w="4592"/>
+            <w:tcW w:type="dxa" w:w="4000"/>
           </w:tcPr>
           <w:p>
             <w:pPr>
-              <w:spacing w:before="0" w:after="0" w:line="276" w:lineRule="auto"/>
+              <w:spacing w:before="0" w:after="40" w:line="240" w:lineRule="auto"/>
+              <w:jc w:val="center"/>
+            </w:pPr>
+            <w:r/>
+            <w:r>
+              <w:rPr>
+                <w:rFonts w:ascii="Times New Roman" w:hAnsi="Times New Roman"/>
+                <w:sz w:val="22"/>
+              </w:rPr>
+              <w:t>{tempat}, {tanggal}</w:t>
+            </w:r>
+          </w:p>
+          <w:p>
+            <w:pPr>
+              <w:spacing w:before="40" w:after="0" w:line="240" w:lineRule="auto"/>
+              <w:jc w:val="center"/>
             </w:pPr>
             <w:r>
               <w:rPr>
                 <w:rFonts w:ascii="Times New Roman" w:hAnsi="Times New Roman"/>
                 <w:sz w:val="22"/>
               </w:rPr>
-              <w:t>{tempat}, {tanggal}</w:t>
-              <w:br/>
+              <w:t>Yang menyatakan,</w:t>
             </w:r>
-            <w:r>
-              <w:rPr>
-                <w:rFonts w:ascii="Times New Roman" w:hAnsi="Times New Roman"/>
-                <w:sz w:val="22"/>
-              </w:rPr>
-              <w:t>Yang menyatakan,</w:t>
-              <w:br/>
-              <w:br/>
-              <w:br/>
-            </w:r>
+          </w:p>
+          <w:p>
+            <w:pPr>
+              <w:spacing w:before="900" w:after="900" w:line="240" w:lineRule="auto"/>
+              <w:jc w:val="center"/>
+            </w:pPr>
             <w:r>
               <w:rPr>
                 <w:rFonts w:ascii="Times New Roman" w:hAnsi="Times New Roman"/>
@@ -612,18 +630,20 @@
                 <w:sz w:val="18"/>
               </w:rPr>
               <w:t>Materai 10.000</w:t>
-              <w:br/>
-              <w:br/>
-              <w:br/>
-              <w:br/>
             </w:r>
+          </w:p>
+          <w:p>
+            <w:pPr>
+              <w:spacing w:before="0" w:after="0" w:line="240" w:lineRule="auto"/>
+              <w:jc w:val="center"/>
+            </w:pPr>
             <w:r>
               <w:rPr>
                 <w:rFonts w:ascii="Times New Roman" w:hAnsi="Times New Roman"/>
                 <w:b/>
                 <w:sz w:val="22"/>
               </w:rPr>
-              <w:t>( {nama} )</w:t>
+              <w:t>({nama})</w:t>
             </w:r>
           </w:p>
         </w:tc>

</xml_diff>